<commit_message>
RSM v3 title page: add full corresponding author address
Co-Authored-By: Tatsuki Onishi <bougtoir@gmail.com>
</commit_message>
<xml_diff>
--- a/results/manuscript/rsm_submission/title_page_rsm_v3.docx
+++ b/results/manuscript/rsm_submission/title_page_rsm_v3.docx
@@ -38,7 +38,15 @@
     </w:p>
     <w:p>
       <w:r>
+        <w:rPr>
+          <w:i/>
+        </w:rPr>
         <w:t>bougtoir@gmail.com</w:t>
+      </w:r>
+    </w:p>
+    <w:p>
+      <w:r>
+        <w:t>1-1-1 Bamba, Hikone, Shiga 522-8522 Japan</w:t>
       </w:r>
     </w:p>
     <w:sectPr>

</xml_diff>